<commit_message>
chore: update allergy referral document template
</commit_message>
<xml_diff>
--- a/public/templates/Allergia vizsgálat kérése-formanyomtatvány.docx
+++ b/public/templates/Allergia vizsgálat kérése-formanyomtatvány.docx
@@ -131,15 +131,6 @@
     <w:p>
       <w:pPr>
         <w:ind w:right="-290"/>
-        <w:rPr>
-          <w:sz w:val="24"/>
-          <w:szCs w:val="24"/>
-        </w:rPr>
-      </w:pPr>
-    </w:p>
-    <w:p>
-      <w:pPr>
-        <w:ind w:right="-290"/>
         <w:jc w:val="both"/>
         <w:rPr>
           <w:sz w:val="24"/>
@@ -277,6 +268,31 @@
           <w:sz w:val="24"/>
           <w:szCs w:val="24"/>
         </w:rPr>
+        <w:t>Fent nevezett páciens {kezelesre_erkezes_indoka} kapcsán vettük kezelésbe, aminek finanszírozásához egyedi méltányossági kérelmet tervez beadni.</w:t>
+      </w:r>
+    </w:p>
+    <w:p>
+      <w:pPr>
+        <w:ind w:right="-290"/>
+        <w:rPr>
+          <w:sz w:val="24"/>
+          <w:szCs w:val="24"/>
+        </w:rPr>
+      </w:pPr>
+    </w:p>
+    <w:p>
+      <w:pPr>
+        <w:ind w:right="-290"/>
+        <w:rPr>
+          <w:sz w:val="24"/>
+          <w:szCs w:val="24"/>
+        </w:rPr>
+      </w:pPr>
+      <w:r>
+        <w:rPr>
+          <w:sz w:val="24"/>
+          <w:szCs w:val="24"/>
+        </w:rPr>
         <w:t xml:space="preserve">Budapest, </w:t>
       </w:r>
       <w:r>
@@ -304,15 +320,6 @@
           <w:szCs w:val="24"/>
         </w:rPr>
       </w:pPr>
-    </w:p>
-    <w:p>
-      <w:pPr>
-        <w:ind w:right="-290"/>
-        <w:rPr>
-          <w:sz w:val="24"/>
-          <w:szCs w:val="24"/>
-        </w:rPr>
-      </w:pPr>
       <w:r>
         <w:rPr>
           <w:sz w:val="24"/>
@@ -327,15 +334,6 @@
         </w:rPr>
         <w:t>.</w:t>
       </w:r>
-    </w:p>
-    <w:p>
-      <w:pPr>
-        <w:ind w:right="-290"/>
-        <w:rPr>
-          <w:sz w:val="24"/>
-          <w:szCs w:val="24"/>
-        </w:rPr>
-      </w:pPr>
     </w:p>
     <w:p>
       <w:pPr>
@@ -4401,6 +4399,12 @@
 </file>
 
 <file path=customXml/item1.xml><?xml version="1.0" encoding="utf-8"?>
+<p:properties xmlns:p="http://schemas.microsoft.com/office/2006/metadata/properties" xmlns:xsi="http://www.w3.org/2001/XMLSchema-instance" xmlns:pc="http://schemas.microsoft.com/office/infopath/2007/PartnerControls">
+  <documentManagement/>
+</p:properties>
+</file>
+
+<file path=customXml/item2.xml><?xml version="1.0" encoding="utf-8"?>
 <ct:contentTypeSchema xmlns:ct="http://schemas.microsoft.com/office/2006/metadata/contentType" xmlns:ma="http://schemas.microsoft.com/office/2006/metadata/properties/metaAttributes" ct:_="" ma:_="" ma:contentTypeName="Dokumentum" ma:contentTypeID="0x010100656E644E3E13C644A4F08F73C4C34C06" ma:contentTypeVersion="6" ma:contentTypeDescription="Új dokumentum létrehozása." ma:contentTypeScope="" ma:versionID="98164f813d897f6a06fa688dc604635b">
   <xsd:schema xmlns:xsd="http://www.w3.org/2001/XMLSchema" xmlns:xs="http://www.w3.org/2001/XMLSchema" xmlns:p="http://schemas.microsoft.com/office/2006/metadata/properties" xmlns:ns2="0d1e173b-b6c2-411f-ba70-4e1d032168b5" xmlns:ns3="0d847f4b-044e-4d59-9de5-b4ec1ec7f871" targetNamespace="http://schemas.microsoft.com/office/2006/metadata/properties" ma:root="true" ma:fieldsID="0672d0cf1397cf46b71ca81eefa1cfdd" ns2:_="" ns3:_="">
     <xsd:import namespace="0d1e173b-b6c2-411f-ba70-4e1d032168b5"/>
@@ -4577,17 +4581,7 @@
 </ct:contentTypeSchema>
 </file>
 
-<file path=customXml/item2.xml><?xml version="1.0" encoding="utf-8"?>
-<p:properties xmlns:p="http://schemas.microsoft.com/office/2006/metadata/properties" xmlns:xsi="http://www.w3.org/2001/XMLSchema-instance" xmlns:pc="http://schemas.microsoft.com/office/infopath/2007/PartnerControls">
-  <documentManagement/>
-</p:properties>
-</file>
-
 <file path=customXml/item3.xml><?xml version="1.0" encoding="utf-8"?>
-<b:Sources xmlns:b="http://schemas.openxmlformats.org/officeDocument/2006/bibliography" xmlns="http://schemas.openxmlformats.org/officeDocument/2006/bibliography" SelectedStyle="/APASixthEditionOfficeOnline.xsl" StyleName="APA" Version="6"/>
-</file>
-
-<file path=customXml/item4.xml><?xml version="1.0" encoding="utf-8"?>
 <?mso-contentType ?>
 <FormTemplates xmlns="http://schemas.microsoft.com/sharepoint/v3/contenttype/forms">
   <Display>DocumentLibraryForm</Display>
@@ -4596,7 +4590,20 @@
 </FormTemplates>
 </file>
 
+<file path=customXml/item4.xml><?xml version="1.0" encoding="utf-8"?>
+<b:Sources xmlns:b="http://schemas.openxmlformats.org/officeDocument/2006/bibliography" xmlns="http://schemas.openxmlformats.org/officeDocument/2006/bibliography" SelectedStyle="/APASixthEditionOfficeOnline.xsl" StyleName="APA" Version="6"/>
+</file>
+
 <file path=customXml/itemProps1.xml><?xml version="1.0" encoding="utf-8"?>
+<ds:datastoreItem xmlns:ds="http://schemas.openxmlformats.org/officeDocument/2006/customXml" ds:itemID="{F3FD7279-1ED5-4062-BCCB-F397A872D737}">
+  <ds:schemaRefs>
+    <ds:schemaRef ds:uri="http://schemas.microsoft.com/office/2006/metadata/properties"/>
+    <ds:schemaRef ds:uri="http://schemas.microsoft.com/office/infopath/2007/PartnerControls"/>
+  </ds:schemaRefs>
+</ds:datastoreItem>
+</file>
+
+<file path=customXml/itemProps2.xml><?xml version="1.0" encoding="utf-8"?>
 <ds:datastoreItem xmlns:ds="http://schemas.openxmlformats.org/officeDocument/2006/customXml" ds:itemID="{C407A6C3-EDA1-48A1-8B00-7D6F7C24F4DC}">
   <ds:schemaRefs>
     <ds:schemaRef ds:uri="http://schemas.microsoft.com/office/2006/metadata/contentType"/>
@@ -4615,27 +4622,18 @@
 </ds:datastoreItem>
 </file>
 
-<file path=customXml/itemProps2.xml><?xml version="1.0" encoding="utf-8"?>
-<ds:datastoreItem xmlns:ds="http://schemas.openxmlformats.org/officeDocument/2006/customXml" ds:itemID="{F3FD7279-1ED5-4062-BCCB-F397A872D737}">
+<file path=customXml/itemProps3.xml><?xml version="1.0" encoding="utf-8"?>
+<ds:datastoreItem xmlns:ds="http://schemas.openxmlformats.org/officeDocument/2006/customXml" ds:itemID="{E84A23D7-45AF-4A32-9FDB-BF50A7331E47}">
   <ds:schemaRefs>
-    <ds:schemaRef ds:uri="http://schemas.microsoft.com/office/2006/metadata/properties"/>
-    <ds:schemaRef ds:uri="http://schemas.microsoft.com/office/infopath/2007/PartnerControls"/>
+    <ds:schemaRef ds:uri="http://schemas.microsoft.com/sharepoint/v3/contenttype/forms"/>
   </ds:schemaRefs>
 </ds:datastoreItem>
 </file>
 
-<file path=customXml/itemProps3.xml><?xml version="1.0" encoding="utf-8"?>
+<file path=customXml/itemProps4.xml><?xml version="1.0" encoding="utf-8"?>
 <ds:datastoreItem xmlns:ds="http://schemas.openxmlformats.org/officeDocument/2006/customXml" ds:itemID="{14838455-FE4E-4F01-A161-41D9FE59504C}">
   <ds:schemaRefs>
     <ds:schemaRef ds:uri="http://schemas.openxmlformats.org/officeDocument/2006/bibliography"/>
   </ds:schemaRefs>
 </ds:datastoreItem>
-</file>
-
-<file path=customXml/itemProps4.xml><?xml version="1.0" encoding="utf-8"?>
-<ds:datastoreItem xmlns:ds="http://schemas.openxmlformats.org/officeDocument/2006/customXml" ds:itemID="{E84A23D7-45AF-4A32-9FDB-BF50A7331E47}">
-  <ds:schemaRefs>
-    <ds:schemaRef ds:uri="http://schemas.microsoft.com/sharepoint/v3/contenttype/forms"/>
-  </ds:schemaRefs>
-</ds:datastoreItem>
 </file>
</xml_diff>